<commit_message>
Actualización de fecha CFF
</commit_message>
<xml_diff>
--- a/Fernando/Words/Reporte_Capacitacion_Fernando.docx
+++ b/Fernando/Words/Reporte_Capacitacion_Fernando.docx
@@ -373,7 +373,7 @@
           <w:color w:val="006FC0"/>
           <w:lang w:val="es-MX"/>
         </w:rPr>
-        <w:t>4</w:t>
+        <w:t>5</w:t>
       </w:r>
       <w:r>
         <w:rPr>
@@ -1066,12 +1066,12 @@
         </w:p>
       </w:sdtContent>
     </w:sdt>
-    <w:bookmarkStart w:id="0" w:name="_Toc232755717" w:displacedByCustomXml="prev"/>
-    <w:bookmarkStart w:id="1" w:name="_Toc232588035" w:displacedByCustomXml="prev"/>
-    <w:bookmarkStart w:id="2" w:name="_Toc232543711" w:displacedByCustomXml="prev"/>
-    <w:bookmarkStart w:id="3" w:name="_Toc232414829" w:displacedByCustomXml="prev"/>
-    <w:bookmarkStart w:id="4" w:name="_Toc232169542" w:displacedByCustomXml="prev"/>
-    <w:bookmarkStart w:id="5" w:name="_Toc232169371" w:displacedByCustomXml="prev"/>
+    <w:bookmarkStart w:id="0" w:name="_Toc232169371" w:displacedByCustomXml="prev"/>
+    <w:bookmarkStart w:id="1" w:name="_Toc232169542" w:displacedByCustomXml="prev"/>
+    <w:bookmarkStart w:id="2" w:name="_Toc232414829" w:displacedByCustomXml="prev"/>
+    <w:bookmarkStart w:id="3" w:name="_Toc232543711" w:displacedByCustomXml="prev"/>
+    <w:bookmarkStart w:id="4" w:name="_Toc232588035" w:displacedByCustomXml="prev"/>
+    <w:bookmarkStart w:id="5" w:name="_Toc232755717" w:displacedByCustomXml="prev"/>
     <w:p>
       <w:r>
         <w:t>.</w:t>
@@ -1765,7 +1765,6 @@
         </w:rPr>
         <w:t xml:space="preserve"> </w:t>
       </w:r>
-      <w:proofErr w:type="spellStart"/>
       <w:proofErr w:type="gramStart"/>
       <w:r>
         <w:rPr>
@@ -1774,17 +1773,7 @@
           <w:i/>
           <w:iCs/>
         </w:rPr>
-        <w:t>add</w:t>
-      </w:r>
-      <w:proofErr w:type="spellEnd"/>
-      <w:r>
-        <w:rPr>
-          <w:b/>
-          <w:bCs/>
-          <w:i/>
-          <w:iCs/>
-        </w:rPr>
-        <w:t xml:space="preserve"> .</w:t>
+        <w:t>add .</w:t>
       </w:r>
       <w:proofErr w:type="gramEnd"/>
       <w:r>
@@ -3561,6 +3550,7 @@
   <w:style w:type="character" w:default="1" w:styleId="Fuentedeprrafopredeter">
     <w:name w:val="Default Paragraph Font"/>
     <w:uiPriority w:val="1"/>
+    <w:semiHidden/>
     <w:unhideWhenUsed/>
   </w:style>
   <w:style w:type="table" w:default="1" w:styleId="Tablanormal">

</xml_diff>